<commit_message>
Add student identity to report and README
</commit_message>
<xml_diff>
--- a/docs/Lab_01_Report_Variant_7.docx
+++ b/docs/Lab_01_Report_Variant_7.docx
@@ -76,7 +76,7 @@
           <w:b w:val="0"/>
           <w:sz w:val="28"/>
         </w:rPr>
-        <w:t>Виконав(ла): ______________________________</w:t>
+        <w:t>Виконав: Денис Заставний</w:t>
       </w:r>
     </w:p>
     <w:p>
@@ -712,6 +712,11 @@
         <w:t>Лабораторна робота №1 з курсу «Професійний Python».</w:t>
         <w:br/>
         <w:t>Варіант №7 — «Система оцінювання студентів».</w:t>
+        <w:br/>
+        <w:br/>
+        <w:t>## Автор</w:t>
+        <w:br/>
+        <w:t>Денис Заставний</w:t>
         <w:br/>
         <w:br/>
         <w:t>## Встановлення</w:t>

</xml_diff>

<commit_message>
Complete report title page details
</commit_message>
<xml_diff>
--- a/docs/Lab_01_Report_Variant_7.docx
+++ b/docs/Lab_01_Report_Variant_7.docx
@@ -76,7 +76,7 @@
           <w:b w:val="0"/>
           <w:sz w:val="28"/>
         </w:rPr>
-        <w:t>Виконав: Денис Заставний</w:t>
+        <w:t>Виконав(ла): Денис Заставний</w:t>
       </w:r>
     </w:p>
     <w:p>
@@ -91,7 +91,7 @@
           <w:b w:val="0"/>
           <w:sz w:val="28"/>
         </w:rPr>
-        <w:t>Група: ___________________________________</w:t>
+        <w:t>Група: ФЕП-32</w:t>
       </w:r>
     </w:p>
     <w:p>
@@ -106,7 +106,7 @@
           <w:b w:val="0"/>
           <w:sz w:val="28"/>
         </w:rPr>
-        <w:t>Перевірив(ла): ____________________________</w:t>
+        <w:t>Перевірив(ла): Свелеба Сергій Андрійович</w:t>
       </w:r>
     </w:p>
     <w:p>
@@ -121,7 +121,7 @@
           <w:b w:val="0"/>
           <w:sz w:val="28"/>
         </w:rPr>
-        <w:t>Дата: ____________________________________</w:t>
+        <w:t>Дата: 17.10.2026</w:t>
       </w:r>
     </w:p>
     <w:p>

</xml_diff>

<commit_message>
Add checker-compatible Lab 01 layout and verified report metadata
</commit_message>
<xml_diff>
--- a/docs/Lab_01_Report_Variant_7.docx
+++ b/docs/Lab_01_Report_Variant_7.docx
@@ -76,7 +76,7 @@
           <w:b w:val="0"/>
           <w:sz w:val="28"/>
         </w:rPr>
-        <w:t>Виконав(ла): Денис Заставний</w:t>
+        <w:t>Виконав: Заставний Денис</w:t>
       </w:r>
     </w:p>
     <w:p>
@@ -91,7 +91,7 @@
           <w:b w:val="0"/>
           <w:sz w:val="28"/>
         </w:rPr>
-        <w:t>Група: ФЕП-32</w:t>
+        <w:t>Група: ФеП-32</w:t>
       </w:r>
     </w:p>
     <w:p>
@@ -716,7 +716,7 @@
         <w:br/>
         <w:t>## Автор</w:t>
         <w:br/>
-        <w:t>Денис Заставний</w:t>
+        <w:t>Заставний Денис</w:t>
         <w:br/>
         <w:br/>
         <w:t>## Встановлення</w:t>

</xml_diff>